<commit_message>
Ajout des packages ommis par erreur
</commit_message>
<xml_diff>
--- a/livrables/Déclaration dUtilisation de lIntelligence Artificielle Générative (IAG).docx
+++ b/livrables/Déclaration dUtilisation de lIntelligence Artificielle Générative (IAG).docx
@@ -213,21 +213,12 @@
                 <w:bCs/>
               </w:rPr>
             </w:pPr>
-            <w:proofErr w:type="spellStart"/>
             <w:r>
               <w:rPr>
                 <w:b/>
                 <w:bCs/>
               </w:rPr>
-              <w:t>Lazhar</w:t>
-            </w:r>
-            <w:proofErr w:type="spellEnd"/>
-            <w:r>
-              <w:rPr>
-                <w:b/>
-                <w:bCs/>
-              </w:rPr>
-              <w:t xml:space="preserve"> Khelifi</w:t>
+              <w:t>Lazhar Khelifi</w:t>
             </w:r>
           </w:p>
         </w:tc>
@@ -720,39 +711,7 @@
           <w:b/>
           <w:bCs/>
         </w:rPr>
-        <w:t xml:space="preserve">Indiquez les outils IA utilisés, ex. : </w:t>
-      </w:r>
-      <w:proofErr w:type="spellStart"/>
-      <w:r>
-        <w:rPr>
-          <w:b/>
-          <w:bCs/>
-        </w:rPr>
-        <w:t>ChatGPT</w:t>
-      </w:r>
-      <w:proofErr w:type="spellEnd"/>
-      <w:r>
-        <w:rPr>
-          <w:b/>
-          <w:bCs/>
-        </w:rPr>
-        <w:t xml:space="preserve">, </w:t>
-      </w:r>
-      <w:proofErr w:type="spellStart"/>
-      <w:r>
-        <w:rPr>
-          <w:b/>
-          <w:bCs/>
-        </w:rPr>
-        <w:t>Copilot</w:t>
-      </w:r>
-      <w:proofErr w:type="spellEnd"/>
-      <w:r>
-        <w:rPr>
-          <w:b/>
-          <w:bCs/>
-        </w:rPr>
-        <w:t xml:space="preserve">, </w:t>
+        <w:t xml:space="preserve">Indiquez les outils IA utilisés, ex. : ChatGPT, Copilot, </w:t>
       </w:r>
       <w:r>
         <w:rPr>
@@ -859,15 +818,65 @@
         <w:t xml:space="preserve"> : </w:t>
       </w:r>
       <w:r>
-        <w:t xml:space="preserve">L’IAG m’a aidé à placer des éléments dont je </w:t>
-      </w:r>
-      <w:proofErr w:type="gramStart"/>
-      <w:r>
-        <w:t>n’était</w:t>
-      </w:r>
-      <w:proofErr w:type="gramEnd"/>
-      <w:r>
-        <w:t xml:space="preserve"> pas sur comment faire (exemple : les icônes).</w:t>
+        <w:t>L’IAG m’a aidé à placer des éléments dont je n’étai</w:t>
+      </w:r>
+      <w:r>
+        <w:t xml:space="preserve">s </w:t>
+      </w:r>
+      <w:r>
+        <w:t>pas sur comment faire (exemple : les icônes).</w:t>
+      </w:r>
+    </w:p>
+    <w:p>
+      <w:pPr>
+        <w:numPr>
+          <w:ilvl w:val="0"/>
+          <w:numId w:val="4"/>
+        </w:numPr>
+      </w:pPr>
+      <w:r>
+        <w:rPr>
+          <w:b/>
+          <w:bCs/>
+        </w:rPr>
+        <w:t xml:space="preserve">Exemple </w:t>
+      </w:r>
+      <w:r>
+        <w:rPr>
+          <w:b/>
+          <w:bCs/>
+        </w:rPr>
+        <w:t>3</w:t>
+      </w:r>
+      <w:r>
+        <w:t xml:space="preserve"> : </w:t>
+      </w:r>
+      <w:r>
+        <w:t xml:space="preserve">L’IAG m’a aidé à </w:t>
+      </w:r>
+      <w:r>
+        <w:t>structurer le dossier du projet.</w:t>
+      </w:r>
+    </w:p>
+    <w:p>
+      <w:pPr>
+        <w:numPr>
+          <w:ilvl w:val="0"/>
+          <w:numId w:val="4"/>
+        </w:numPr>
+      </w:pPr>
+      <w:r>
+        <w:rPr>
+          <w:b/>
+          <w:bCs/>
+        </w:rPr>
+        <w:t>Exemple 4 </w:t>
+      </w:r>
+      <w:r>
+        <w:t>:</w:t>
+      </w:r>
+      <w:r>
+        <w:t xml:space="preserve"> L’IAG m’a aidé à corriger et restructurer une partie de la description de l’application dans le rapport.</w:t>
       </w:r>
     </w:p>
     <w:p/>
@@ -995,43 +1004,7 @@
         <w:iCs/>
         <w:lang w:val="en-CA"/>
       </w:rPr>
-      <w:t xml:space="preserve">Samah </w:t>
-    </w:r>
-    <w:proofErr w:type="spellStart"/>
-    <w:r>
-      <w:rPr>
-        <w:i/>
-        <w:iCs/>
-        <w:lang w:val="en-CA"/>
-      </w:rPr>
-      <w:t>Kansab</w:t>
-    </w:r>
-    <w:proofErr w:type="spellEnd"/>
-    <w:r>
-      <w:rPr>
-        <w:i/>
-        <w:iCs/>
-        <w:lang w:val="en-CA"/>
-      </w:rPr>
-      <w:t xml:space="preserve"> et </w:t>
-    </w:r>
-    <w:proofErr w:type="spellStart"/>
-    <w:r>
-      <w:rPr>
-        <w:i/>
-        <w:iCs/>
-        <w:lang w:val="en-CA"/>
-      </w:rPr>
-      <w:t>Lazhar</w:t>
-    </w:r>
-    <w:proofErr w:type="spellEnd"/>
-    <w:r>
-      <w:rPr>
-        <w:i/>
-        <w:iCs/>
-        <w:lang w:val="en-CA"/>
-      </w:rPr>
-      <w:t xml:space="preserve"> Khelifi</w:t>
+      <w:t>Samah Kansab et Lazhar Khelifi</w:t>
     </w:r>
   </w:p>
   <w:p>

</xml_diff>